<commit_message>
Add gold mini-court boundary, solid keys, 3-point lines and centre circle
Gold mini-court boundary now sits on the tile edge with the white 3x3
boundary 0.10 m inside it. Mini keys are solid gold under the white
lines, each end gets a 4.0 m gold 3-point line, and the halfway line has
a 0.6 m centre circle. Logo moves to the open end, left of centre, to
stay clear of the new lines. v3 brief draft updated to match.

Co-Authored-By: Claude Opus 5.5 <noreply@anthropic.com>
Claude-Session: https://claude.ai/code/session_01UoyugYzmaTfuHsWdpUMhBc
</commit_message>
<xml_diff>
--- a/court-viz/brief/Hoop Hub Phase 1 - Concept Visual Brief v3 (DRAFT).docx
+++ b/court-viz/brief/Hoop Hub Phase 1 - Concept Visual Brief v3 (DRAFT).docx
@@ -146,7 +146,7 @@
                 <w:color w:val="334155"/>
                 <w:sz w:val="18"/>
               </w:rPr>
-              <w:t>Gold markings are now a halfway line running the full 10 m from the 3x3 baseline to the end line, straight through the middle of the 3x3 key, plus a small key at each end. Nothing else.</w:t>
+              <w:t>Gold mini-court markings: a gold boundary just outside the white 3x3 boundary; a halfway line running the full 10 m through the middle of the 3x3 key, with a small centre circle; and at each end a solid gold key, a free-throw semicircle and a small 3-point line. The white 3x3 lines sit on top wherever they cross.</w:t>
             </w:r>
           </w:p>
           <w:p>
@@ -279,7 +279,7 @@
           <w:color w:val="334155"/>
           <w:sz w:val="17"/>
         </w:rPr>
-        <w:t>Orientation reference: 3x3 half court in grey, wider than it is deep, lighter grey key, white lines and arc, Hoop Heroes logo in the front-left corner. Viewed from the open end, looking towards the main hoop.</w:t>
+        <w:t>Orientation reference: 3x3 half court in grey, wider than it is deep, lighter grey key, white lines and arc, Hoop Heroes logo at the open end. Viewed from the open end, looking towards the main hoop. (v3 moves the logo to the open end, left of centre; see Section 3.)</w:t>
       </w:r>
     </w:p>
     <w:p>
@@ -357,7 +357,7 @@
           <w:color w:val="334155"/>
           <w:sz w:val="20"/>
         </w:rPr>
-        <w:t>Hoop Heroes logo (gold hand-and-ball icon, white wordmark) painted in the front-left corner at the open end, reading the right way up for someone standing at the open end.</w:t>
+        <w:t>Hoop Heroes logo (gold hand-and-ball icon, white wordmark) painted at the open end, left of the halfway line, reading the right way up for someone standing at the open end.</w:t>
       </w:r>
     </w:p>
     <w:p>
@@ -919,7 +919,7 @@
                 <w:color w:val="334155"/>
                 <w:sz w:val="18"/>
               </w:rPr>
-              <w:t>14.8 m baseline (FIBA 15 m) x 10.0 m deep (FIBA 11 m). Baseline = tile edge at the Mega Slam end; end line = tile edge at the open end; sidelines = the two 10 m tile edges</w:t>
+              <w:t>14.8 m baseline (FIBA 15 m) x 10.0 m deep (FIBA 11 m). The white boundary lines sit 0.10 m in from the tile edge, just inside the gold mini-court boundary. All dimensions below are measured from the tile edge</w:t>
             </w:r>
           </w:p>
         </w:tc>
@@ -1199,7 +1199,7 @@
                 <w:color w:val="334155"/>
                 <w:sz w:val="18"/>
               </w:rPr>
-              <w:t>Radius 6.75 m from basket centre; straight corner lines 0.90 m in from each sideline, meeting the arc 3.40 m from the baseline; top of arc 8.33 m from the baseline</w:t>
+              <w:t>Radius 6.75 m from basket centre; straight corner lines 0.90 m inside each white sideline (1.0 m from the tile edge), meeting the arc 3.72 m from the baseline; top of arc 8.33 m from the baseline</w:t>
             </w:r>
           </w:p>
         </w:tc>
@@ -1217,7 +1217,7 @@
                 <w:color w:val="334155"/>
                 <w:sz w:val="18"/>
               </w:rPr>
-              <w:t>[FIBA]</w:t>
+              <w:t>[FIBA] radius / [DESIGN] corners</w:t>
             </w:r>
           </w:p>
         </w:tc>
@@ -1311,7 +1311,63 @@
                 <w:color w:val="334155"/>
                 <w:sz w:val="18"/>
               </w:rPr>
-              <w:t>The whole tile area, run across: 14.8 m long between the two 10 m sidelines (its baselines) x 10.0 m wide (the 3x3 baseline and end line are its sidelines). No separate outline</w:t>
+              <w:t>The whole tile area, run across: 14.8 m long between the two 10 m sidelines (its baselines) x 10.0 m wide (its sidelines run along the 3x3 baseline and end line), outlined by the gold boundary</w:t>
+            </w:r>
+          </w:p>
+        </w:tc>
+        <w:tc>
+          <w:tcPr>
+            <w:tcW w:type="dxa" w:w="2041"/>
+          </w:tcPr>
+          <w:p>
+            <w:r/>
+            <w:r>
+              <w:rPr>
+                <w:rFonts w:ascii="Montserrat" w:hAnsi="Montserrat" w:eastAsia="Montserrat"/>
+                <w:b w:val="0"/>
+                <w:i w:val="0"/>
+                <w:color w:val="334155"/>
+                <w:sz w:val="18"/>
+              </w:rPr>
+              <w:t>[DESIGN]</w:t>
+            </w:r>
+          </w:p>
+        </w:tc>
+      </w:tr>
+      <w:tr>
+        <w:tc>
+          <w:tcPr>
+            <w:tcW w:type="dxa" w:w="2381"/>
+          </w:tcPr>
+          <w:p>
+            <w:r/>
+            <w:r>
+              <w:rPr>
+                <w:rFonts w:ascii="Montserrat" w:hAnsi="Montserrat" w:eastAsia="Montserrat"/>
+                <w:b/>
+                <w:i w:val="0"/>
+                <w:color w:val="14264E"/>
+                <w:sz w:val="18"/>
+              </w:rPr>
+              <w:t>Mini court boundary</w:t>
+            </w:r>
+          </w:p>
+        </w:tc>
+        <w:tc>
+          <w:tcPr>
+            <w:tcW w:type="dxa" w:w="5443"/>
+          </w:tcPr>
+          <w:p>
+            <w:r/>
+            <w:r>
+              <w:rPr>
+                <w:rFonts w:ascii="Montserrat" w:hAnsi="Montserrat" w:eastAsia="Montserrat"/>
+                <w:b w:val="0"/>
+                <w:i w:val="0"/>
+                <w:color w:val="334155"/>
+                <w:sz w:val="18"/>
+              </w:rPr>
+              <w:t>Gold, 40 mm, on the tile edge all round; the white 3x3 boundary runs 60 mm inside it</w:t>
             </w:r>
           </w:p>
         </w:tc>
@@ -1367,7 +1423,63 @@
                 <w:color w:val="334155"/>
                 <w:sz w:val="18"/>
               </w:rPr>
-              <w:t>Gold, 7.4 m across, running the full 10 m from the 3x3 baseline to the end line, through the middle of the 3x3 key and under the Mega Slam</w:t>
+              <w:t>Gold, 7.4 m across, running the full 10 m from the baseline to the end line, through the middle of the 3x3 key and under the Mega Slam</w:t>
+            </w:r>
+          </w:p>
+        </w:tc>
+        <w:tc>
+          <w:tcPr>
+            <w:tcW w:type="dxa" w:w="2041"/>
+          </w:tcPr>
+          <w:p>
+            <w:r/>
+            <w:r>
+              <w:rPr>
+                <w:rFonts w:ascii="Montserrat" w:hAnsi="Montserrat" w:eastAsia="Montserrat"/>
+                <w:b w:val="0"/>
+                <w:i w:val="0"/>
+                <w:color w:val="334155"/>
+                <w:sz w:val="18"/>
+              </w:rPr>
+              <w:t>[DESIGN]</w:t>
+            </w:r>
+          </w:p>
+        </w:tc>
+      </w:tr>
+      <w:tr>
+        <w:tc>
+          <w:tcPr>
+            <w:tcW w:type="dxa" w:w="2381"/>
+          </w:tcPr>
+          <w:p>
+            <w:r/>
+            <w:r>
+              <w:rPr>
+                <w:rFonts w:ascii="Montserrat" w:hAnsi="Montserrat" w:eastAsia="Montserrat"/>
+                <w:b/>
+                <w:i w:val="0"/>
+                <w:color w:val="14264E"/>
+                <w:sz w:val="18"/>
+              </w:rPr>
+              <w:t>Mini centre circle</w:t>
+            </w:r>
+          </w:p>
+        </w:tc>
+        <w:tc>
+          <w:tcPr>
+            <w:tcW w:type="dxa" w:w="5443"/>
+          </w:tcPr>
+          <w:p>
+            <w:r/>
+            <w:r>
+              <w:rPr>
+                <w:rFonts w:ascii="Montserrat" w:hAnsi="Montserrat" w:eastAsia="Montserrat"/>
+                <w:b w:val="0"/>
+                <w:i w:val="0"/>
+                <w:color w:val="334155"/>
+                <w:sz w:val="18"/>
+              </w:rPr>
+              <w:t>Gold outline, radius 0.60 m, on the halfway line 5.0 m from the baseline (inside the 3x3 key)</w:t>
             </w:r>
           </w:p>
         </w:tc>
@@ -1423,7 +1535,63 @@
                 <w:color w:val="334155"/>
                 <w:sz w:val="18"/>
               </w:rPr>
-              <w:t>Gold outline only, no fill: 2.75 m deep in from each 10 m sideline x 2.50 m wide, centred 5.0 m from the baseline, with a free-throw semicircle of radius 1.25 m</w:t>
+              <w:t>Solid gold fill: 2.75 m deep in from each 10 m tile edge x 2.50 m wide, centred 5.0 m from the baseline, with a gold free-throw semicircle (outline) of radius 1.25 m. The white 3x3 arc and corner line stay visible over the gold</w:t>
+            </w:r>
+          </w:p>
+        </w:tc>
+        <w:tc>
+          <w:tcPr>
+            <w:tcW w:type="dxa" w:w="2041"/>
+          </w:tcPr>
+          <w:p>
+            <w:r/>
+            <w:r>
+              <w:rPr>
+                <w:rFonts w:ascii="Montserrat" w:hAnsi="Montserrat" w:eastAsia="Montserrat"/>
+                <w:b w:val="0"/>
+                <w:i w:val="0"/>
+                <w:color w:val="334155"/>
+                <w:sz w:val="18"/>
+              </w:rPr>
+              <w:t>[DESIGN]</w:t>
+            </w:r>
+          </w:p>
+        </w:tc>
+      </w:tr>
+      <w:tr>
+        <w:tc>
+          <w:tcPr>
+            <w:tcW w:type="dxa" w:w="2381"/>
+          </w:tcPr>
+          <w:p>
+            <w:r/>
+            <w:r>
+              <w:rPr>
+                <w:rFonts w:ascii="Montserrat" w:hAnsi="Montserrat" w:eastAsia="Montserrat"/>
+                <w:b/>
+                <w:i w:val="0"/>
+                <w:color w:val="14264E"/>
+                <w:sz w:val="18"/>
+              </w:rPr>
+              <w:t>Mini 3-point lines (one each end)</w:t>
+            </w:r>
+          </w:p>
+        </w:tc>
+        <w:tc>
+          <w:tcPr>
+            <w:tcW w:type="dxa" w:w="5443"/>
+          </w:tcPr>
+          <w:p>
+            <w:r/>
+            <w:r>
+              <w:rPr>
+                <w:rFonts w:ascii="Montserrat" w:hAnsi="Montserrat" w:eastAsia="Montserrat"/>
+                <w:b w:val="0"/>
+                <w:i w:val="0"/>
+                <w:color w:val="334155"/>
+                <w:sz w:val="18"/>
+              </w:rPr>
+              <w:t>Gold. Radius 4.0 m from the mini basket centre (0.6 m in from the tile edge, 5.0 m from the baseline); straight corner lines 1.2 m in from the 14.8 m edges, meeting the arc 1.85 m in from the end; top of arc 4.6 m in</w:t>
             </w:r>
           </w:p>
         </w:tc>
@@ -1591,7 +1759,7 @@
                 <w:color w:val="334155"/>
                 <w:sz w:val="18"/>
               </w:rPr>
-              <w:t>Hoop Heroes landscape logo, about 3.0 m wide, front-left corner at the open end (about 0.4 m in from the left sideline and the end line). Clear of the arc and the left mini key</w:t>
+              <w:t>Hoop Heroes landscape logo, about 3.0 m wide (artwork incl. margin), at the open end, left of the halfway line, between the white arc and the end line: roughly 4.4 m to 1.4 m left of centre, about 0.35 m clear of every line</w:t>
             </w:r>
           </w:p>
         </w:tc>
@@ -1828,7 +1996,7 @@
           <w:color w:val="334155"/>
           <w:sz w:val="20"/>
         </w:rPr>
-        <w:t>The key, free-throw line, arc, no-charge semicircle and basket position are full FIBA size. Because the court is 0.2 m narrower, the corner lines meet the arc 3.40 m from the baseline (FIBA 2.99 m).</w:t>
+        <w:t>The key, free-throw line, arc radius, no-charge semicircle and basket position are full FIBA size, measured from the tile edge. FIBA measures from the inner edge of the baseline, which here is 0.15 m in, so the hoop sits about 0.15 m closer to the white baseline than FIBA; this keeps the Mega Slam post off the tiles.</w:t>
       </w:r>
     </w:p>
     <w:p>
@@ -1844,7 +2012,7 @@
           <w:color w:val="334155"/>
           <w:sz w:val="20"/>
         </w:rPr>
-        <w:t>The gold mini-court lines overlap the white ones: the halfway line runs through the 3x3 key, and the white arc crosses each gold key. This is expected; white sits on top where they meet.</w:t>
+        <w:t>The gold mini-court lines overlap the white ones: the halfway line and centre circle sit in the 3x3 key, and the white arc crosses each gold key and gold 3-point line. This is expected; white sits on top where they meet.</w:t>
       </w:r>
     </w:p>
     <w:p>
@@ -2093,7 +2261,7 @@
                 <w:color w:val="334155"/>
                 <w:sz w:val="18"/>
               </w:rPr>
-              <w:t>Gold #fba91a, 40 mm. Halfway line (full 10 m) plus one key at each end ONLY</w:t>
+              <w:t>Gold #fba91a, 40 mm: boundary just outside the white, halfway line, small centre circle, and at each end a key, free-throw semicircle and 3-point line</w:t>
             </w:r>
           </w:p>
         </w:tc>
@@ -2111,7 +2279,7 @@
                 <w:color w:val="334155"/>
                 <w:sz w:val="18"/>
               </w:rPr>
-              <w:t>No fill</w:t>
+              <w:t>Keys solid gold</w:t>
             </w:r>
           </w:p>
         </w:tc>
@@ -2129,7 +2297,7 @@
                 <w:color w:val="334155"/>
                 <w:sz w:val="18"/>
               </w:rPr>
-              <w:t>No separate outline, no centre circle, no 3-point line. Where gold meets white, white sits on top</w:t>
+              <w:t>No other gold. Where gold meets white, white sits on top</w:t>
             </w:r>
           </w:p>
         </w:tc>
@@ -2185,7 +2353,7 @@
                 <w:color w:val="334155"/>
                 <w:sz w:val="18"/>
               </w:rPr>
-              <w:t>Hoop Heroes logo painted in the front-left corner</w:t>
+              <w:t>Hoop Heroes logo painted at the open end, left of the halfway line</w:t>
             </w:r>
           </w:p>
         </w:tc>
@@ -4492,7 +4660,7 @@
           <w:color w:val="334155"/>
           <w:sz w:val="20"/>
         </w:rPr>
-        <w:t>elevated three-quarter view (about 5 to 6 m high) from the open end, looking across the depth of the court to the main hoop, framed like the reference screenshot. Grey half court, lighter key, white arc, logo in the front-left corner. Gold mini markings visible but secondary. Portable hoops folded away; container billboard visible behind and to one side of the hoop.</w:t>
+        <w:t>elevated three-quarter view (about 5 to 6 m high) from the open end, looking across the depth of the court to the main hoop, framed like the reference screenshot. Grey half court, lighter key, white arc, logo at the open end. Gold mini markings visible but secondary. Portable hoops folded away; container billboard visible behind and to one side of the hoop.</w:t>
       </w:r>
     </w:p>
     <w:p>
@@ -4672,7 +4840,7 @@
           <w:color w:val="334155"/>
           <w:sz w:val="20"/>
         </w:rPr>
-        <w:t>child eye height (about 1.1 to 1.2 m), low and wide (24 mm), from the open end near the front-left corner logo, looking towards the main hoop. The logo leads into the frame; the Mega Slam at 10 ft and the container billboard behind it. Warm late-afternoon light.</w:t>
+        <w:t>child eye height (about 1.1 to 1.2 m), low and wide (24 mm), from the open end just behind the logo, looking towards the main hoop. The logo leads into the frame; the Mega Slam at 10 ft and the container billboard behind it. Warm late-afternoon light.</w:t>
       </w:r>
     </w:p>
     <w:p>
@@ -4812,7 +4980,7 @@
           <w:color w:val="334155"/>
           <w:sz w:val="20"/>
         </w:rPr>
-        <w:t>Do not add a gold outline, centre circle or 3-point line to the mini court, or any QR code or text to the container.</w:t>
+        <w:t>Do not add gold markings beyond those listed in Sections 3.1 and 4, or any QR code or text to the container.</w:t>
       </w:r>
     </w:p>
     <w:p>

</xml_diff>

<commit_message>
Simplify markings: grey keys, no no-charge, halfway line or centre circle
All three keys are light grey with gold outlines on the mini keys. The
no-charge semicircle, mini halfway line and centre circle are removed.
v3 brief draft and plan updated to match.

Co-Authored-By: Claude Opus 5.5 <noreply@anthropic.com>
Claude-Session: https://claude.ai/code/session_01UoyugYzmaTfuHsWdpUMhBc
</commit_message>
<xml_diff>
--- a/court-viz/brief/Hoop Hub Phase 1 - Concept Visual Brief v3 (DRAFT).docx
+++ b/court-viz/brief/Hoop Hub Phase 1 - Concept Visual Brief v3 (DRAFT).docx
@@ -146,7 +146,7 @@
                 <w:color w:val="334155"/>
                 <w:sz w:val="18"/>
               </w:rPr>
-              <w:t>Gold mini-court markings: a gold boundary just outside the white 3x3 boundary; a halfway line running the full 10 m through the middle of the 3x3 key, with a small centre circle; and at each end a solid gold key, a free-throw semicircle and a small 3-point line. The white 3x3 lines sit on top wherever they cross.</w:t>
+              <w:t>Markings simplified: all three keys are light grey; the gold mini court is a boundary just outside the white 3x3 boundary, plus at each end a key outline, a free-throw semicircle and a small 3-point line. There is no no-charge semicircle under the Mega Slam, and no mini-court halfway line or centre circle. The white 3x3 lines sit on top wherever they cross.</w:t>
             </w:r>
           </w:p>
           <w:p>
@@ -357,7 +357,7 @@
           <w:color w:val="334155"/>
           <w:sz w:val="20"/>
         </w:rPr>
-        <w:t>Hoop Heroes logo (gold hand-and-ball icon, white wordmark) painted at the open end, left of the halfway line, reading the right way up for someone standing at the open end.</w:t>
+        <w:t>Hoop Heroes logo (gold hand-and-ball icon, white wordmark) painted at the open end, left of centre, reading the right way up for someone standing at the open end.</w:t>
       </w:r>
     </w:p>
     <w:p>
@@ -491,7 +491,7 @@
           <w:color w:val="334155"/>
           <w:sz w:val="20"/>
         </w:rPr>
-        <w:t>a mini basketball court for younger children running across the 3x3 court, at 90 degrees to it. The 3x3 sidelines are its baselines, with a portable hoop at each. The only gold lines are a halfway line and a small key at each end.</w:t>
+        <w:t>a mini basketball court for younger children running across the 3x3 court, at 90 degrees to it. The 3x3 sidelines are its baselines, with a portable hoop at each. Its gold lines are a boundary just outside the white, and at each end a key, a free-throw semicircle and a small 3-point line.</w:t>
       </w:r>
     </w:p>
     <w:p>
@@ -1255,7 +1255,7 @@
                 <w:color w:val="334155"/>
                 <w:sz w:val="18"/>
               </w:rPr>
-              <w:t>Radius 1.25 m under the basket</w:t>
+              <w:t>Left off for a cleaner court</w:t>
             </w:r>
           </w:p>
         </w:tc>
@@ -1273,7 +1273,7 @@
                 <w:color w:val="334155"/>
                 <w:sz w:val="18"/>
               </w:rPr>
-              <w:t>[FIBA]</w:t>
+              <w:t>[DESIGN]</w:t>
             </w:r>
           </w:p>
         </w:tc>
@@ -1405,118 +1405,6 @@
                 <w:color w:val="14264E"/>
                 <w:sz w:val="18"/>
               </w:rPr>
-              <w:t>Mini court halfway line</w:t>
-            </w:r>
-          </w:p>
-        </w:tc>
-        <w:tc>
-          <w:tcPr>
-            <w:tcW w:type="dxa" w:w="5443"/>
-          </w:tcPr>
-          <w:p>
-            <w:r/>
-            <w:r>
-              <w:rPr>
-                <w:rFonts w:ascii="Montserrat" w:hAnsi="Montserrat" w:eastAsia="Montserrat"/>
-                <w:b w:val="0"/>
-                <w:i w:val="0"/>
-                <w:color w:val="334155"/>
-                <w:sz w:val="18"/>
-              </w:rPr>
-              <w:t>Gold, 7.4 m across, running the full 10 m from the baseline to the end line, through the middle of the 3x3 key and under the Mega Slam</w:t>
-            </w:r>
-          </w:p>
-        </w:tc>
-        <w:tc>
-          <w:tcPr>
-            <w:tcW w:type="dxa" w:w="2041"/>
-          </w:tcPr>
-          <w:p>
-            <w:r/>
-            <w:r>
-              <w:rPr>
-                <w:rFonts w:ascii="Montserrat" w:hAnsi="Montserrat" w:eastAsia="Montserrat"/>
-                <w:b w:val="0"/>
-                <w:i w:val="0"/>
-                <w:color w:val="334155"/>
-                <w:sz w:val="18"/>
-              </w:rPr>
-              <w:t>[DESIGN]</w:t>
-            </w:r>
-          </w:p>
-        </w:tc>
-      </w:tr>
-      <w:tr>
-        <w:tc>
-          <w:tcPr>
-            <w:tcW w:type="dxa" w:w="2381"/>
-          </w:tcPr>
-          <w:p>
-            <w:r/>
-            <w:r>
-              <w:rPr>
-                <w:rFonts w:ascii="Montserrat" w:hAnsi="Montserrat" w:eastAsia="Montserrat"/>
-                <w:b/>
-                <w:i w:val="0"/>
-                <w:color w:val="14264E"/>
-                <w:sz w:val="18"/>
-              </w:rPr>
-              <w:t>Mini centre circle</w:t>
-            </w:r>
-          </w:p>
-        </w:tc>
-        <w:tc>
-          <w:tcPr>
-            <w:tcW w:type="dxa" w:w="5443"/>
-          </w:tcPr>
-          <w:p>
-            <w:r/>
-            <w:r>
-              <w:rPr>
-                <w:rFonts w:ascii="Montserrat" w:hAnsi="Montserrat" w:eastAsia="Montserrat"/>
-                <w:b w:val="0"/>
-                <w:i w:val="0"/>
-                <w:color w:val="334155"/>
-                <w:sz w:val="18"/>
-              </w:rPr>
-              <w:t>Gold outline, radius 0.60 m, on the halfway line 5.0 m from the baseline (inside the 3x3 key)</w:t>
-            </w:r>
-          </w:p>
-        </w:tc>
-        <w:tc>
-          <w:tcPr>
-            <w:tcW w:type="dxa" w:w="2041"/>
-          </w:tcPr>
-          <w:p>
-            <w:r/>
-            <w:r>
-              <w:rPr>
-                <w:rFonts w:ascii="Montserrat" w:hAnsi="Montserrat" w:eastAsia="Montserrat"/>
-                <w:b w:val="0"/>
-                <w:i w:val="0"/>
-                <w:color w:val="334155"/>
-                <w:sz w:val="18"/>
-              </w:rPr>
-              <w:t>[DESIGN]</w:t>
-            </w:r>
-          </w:p>
-        </w:tc>
-      </w:tr>
-      <w:tr>
-        <w:tc>
-          <w:tcPr>
-            <w:tcW w:type="dxa" w:w="2381"/>
-          </w:tcPr>
-          <w:p>
-            <w:r/>
-            <w:r>
-              <w:rPr>
-                <w:rFonts w:ascii="Montserrat" w:hAnsi="Montserrat" w:eastAsia="Montserrat"/>
-                <w:b/>
-                <w:i w:val="0"/>
-                <w:color w:val="14264E"/>
-                <w:sz w:val="18"/>
-              </w:rPr>
               <w:t>Mini keys (one each end)</w:t>
             </w:r>
           </w:p>
@@ -1535,7 +1423,7 @@
                 <w:color w:val="334155"/>
                 <w:sz w:val="18"/>
               </w:rPr>
-              <w:t>Solid gold fill: 2.75 m deep in from each 10 m tile edge x 2.50 m wide, centred 5.0 m from the baseline, with a gold free-throw semicircle (outline) of radius 1.25 m. The white 3x3 arc and corner line stay visible over the gold</w:t>
+              <w:t>Light grey fill (as the 3x3 key) with a gold outline: 2.75 m deep in from each 10 m tile edge x 2.50 m wide, centred 5.0 m from the baseline, with a gold free-throw semicircle of radius 1.25 m. The white 3x3 arc and corner line run over the top</w:t>
             </w:r>
           </w:p>
         </w:tc>
@@ -1759,7 +1647,7 @@
                 <w:color w:val="334155"/>
                 <w:sz w:val="18"/>
               </w:rPr>
-              <w:t>Hoop Heroes landscape logo, about 3.0 m wide (artwork incl. margin), at the open end, left of the halfway line, between the white arc and the end line: roughly 4.4 m to 1.4 m left of centre, about 0.35 m clear of every line</w:t>
+              <w:t>Hoop Heroes landscape logo, about 3.0 m wide (artwork incl. margin), at the open end, left of centre, between the white arc and the end line: roughly 4.4 m to 1.4 m left of the centre line, about 0.35 m clear of every line</w:t>
             </w:r>
           </w:p>
         </w:tc>
@@ -1996,7 +1884,7 @@
           <w:color w:val="334155"/>
           <w:sz w:val="20"/>
         </w:rPr>
-        <w:t>The key, free-throw line, arc radius, no-charge semicircle and basket position are full FIBA size, measured from the tile edge. FIBA measures from the inner edge of the baseline, which here is 0.15 m in, so the hoop sits about 0.15 m closer to the white baseline than FIBA; this keeps the Mega Slam post off the tiles.</w:t>
+        <w:t>The key, free-throw line, arc radius and basket position are full FIBA size, measured from the tile edge. FIBA measures from the inner edge of the baseline, which here is 0.15 m in, so the hoop sits about 0.15 m closer to the white baseline than FIBA; this keeps the Mega Slam post off the tiles. The no-charge semicircle is left off.</w:t>
       </w:r>
     </w:p>
     <w:p>
@@ -2012,7 +1900,7 @@
           <w:color w:val="334155"/>
           <w:sz w:val="20"/>
         </w:rPr>
-        <w:t>The gold mini-court lines overlap the white ones: the halfway line and centre circle sit in the 3x3 key, and the white arc crosses each gold key and gold 3-point line. This is expected; white sits on top where they meet.</w:t>
+        <w:t>The gold mini-court lines overlap the white ones: the white arc crosses each mini key and gold 3-point line. This is expected; white sits on top where they meet.</w:t>
       </w:r>
     </w:p>
     <w:p>
@@ -2261,7 +2149,7 @@
                 <w:color w:val="334155"/>
                 <w:sz w:val="18"/>
               </w:rPr>
-              <w:t>Gold #fba91a, 40 mm: boundary just outside the white, halfway line, small centre circle, and at each end a key, free-throw semicircle and 3-point line</w:t>
+              <w:t>Gold #fba91a, 40 mm: boundary just outside the white, and at each end a key outline, free-throw semicircle and 3-point line</w:t>
             </w:r>
           </w:p>
         </w:tc>
@@ -2279,7 +2167,7 @@
                 <w:color w:val="334155"/>
                 <w:sz w:val="18"/>
               </w:rPr>
-              <w:t>Keys solid gold</w:t>
+              <w:t>Mini keys light grey, as the 3x3 key</w:t>
             </w:r>
           </w:p>
         </w:tc>
@@ -2297,7 +2185,7 @@
                 <w:color w:val="334155"/>
                 <w:sz w:val="18"/>
               </w:rPr>
-              <w:t>No other gold. Where gold meets white, white sits on top</w:t>
+              <w:t>No halfway line, no centre circle. Where gold meets white, white sits on top</w:t>
             </w:r>
           </w:p>
         </w:tc>
@@ -2353,7 +2241,7 @@
                 <w:color w:val="334155"/>
                 <w:sz w:val="18"/>
               </w:rPr>
-              <w:t>Hoop Heroes logo painted at the open end, left of the halfway line</w:t>
+              <w:t>Hoop Heroes logo painted at the open end, left of centre</w:t>
             </w:r>
           </w:p>
         </w:tc>
@@ -4696,7 +4584,7 @@
           <w:color w:val="334155"/>
           <w:sz w:val="20"/>
         </w:rPr>
-        <w:t>orthographic or near-orthographic view straight down, framing the tiles, both portable hoops (out) and the container. Must show both line systems clearly (white 3x3, gold halfway line and keys) and the corner logo. Use it to cross-check against the plan.</w:t>
+        <w:t>orthographic or near-orthographic view straight down, framing the tiles, both portable hoops (out) and the container. Must show both line systems clearly (white 3x3; gold boundary, keys and 3-point lines) and the logo. Use it to cross-check against the plan.</w:t>
       </w:r>
     </w:p>
     <w:p>
@@ -4980,7 +4868,7 @@
           <w:color w:val="334155"/>
           <w:sz w:val="20"/>
         </w:rPr>
-        <w:t>Do not add gold markings beyond those listed in Sections 3.1 and 4, or any QR code or text to the container.</w:t>
+        <w:t>Do not add markings beyond those listed in Sections 3.1 and 4: no no-charge semicircle, mini halfway line or centre circle, and no QR code or text on the container.</w:t>
       </w:r>
     </w:p>
     <w:p>

</xml_diff>